<commit_message>
Visitas técnicas sep: KAMIMO sin datos financieros del período
Co-Authored-By: Claude Sonnet 5.5 <noreply@anthropic.com>
Claude-Session: https://claude.ai/code/session_01LZr6Sj75jGnd7Q2crDgqA4
</commit_message>
<xml_diff>
--- a/analisis/Texto_Visitas_Tecnicas_Sep2026.docx
+++ b/analisis/Texto_Visitas_Tecnicas_Sep2026.docx
@@ -26,7 +26,7 @@
         <w:jc w:val="both"/>
       </w:pPr>
       <w:r>
-        <w:t>De los 7 emprendimientos visitados en septiembre de 2026, todos muestran evaluaciones altas (4-5) en compromiso, gestión y actitud del emprendedor. Las principales alertas se concentran en el manejo financiero y flujo de caja de cuatro casos:</w:t>
+        <w:t>De los 7 emprendimientos visitados en septiembre de 2026, todos muestran evaluaciones altas (4-5) en compromiso, gestión y actitud del emprendedor. Las principales alertas se concentran en el manejo financiero y flujo de caja de cinco casos:</w:t>
       </w:r>
     </w:p>
     <w:p>
@@ -99,12 +99,29 @@
     </w:p>
     <w:p>
       <w:pPr>
+        <w:spacing w:after="60"/>
+        <w:ind w:left="1191" w:hanging="340"/>
+        <w:jc w:val="both"/>
+      </w:pPr>
+      <w:r>
+        <w:rPr>
+          <w:b/>
+        </w:rPr>
+        <w:t>●</w:t>
+        <w:tab/>
+      </w:r>
+      <w:r>
+        <w:t>KAMIMO: no registra información financiera en el período, por lo que no es posible validar el flujo de caja ni el manejo financiero; la última venta acumulada reportada es de USD 2.212,43 (mayo-julio).</w:t>
+      </w:r>
+    </w:p>
+    <w:p>
+      <w:pPr>
         <w:spacing w:after="120"/>
         <w:ind w:left="425"/>
         <w:jc w:val="both"/>
       </w:pPr>
       <w:r>
-        <w:t>Los demás emprendimientos (KAMIMO, MARKEZINA, RUNAWANA) presentan manejo financiero adecuado y flujo de caja positivo, sin alertas relevantes.</w:t>
+        <w:t>Los demás emprendimientos (MARKEZINA, RUNAWANA) presentan manejo financiero adecuado y flujo de caja positivo, sin alertas relevantes.</w:t>
       </w:r>
     </w:p>
     <w:p>
@@ -174,7 +191,7 @@
         <w:t xml:space="preserve">KAMIMO. </w:t>
       </w:r>
       <w:r>
-        <w:t>Alto nivel de compromiso y participación durante el proceso de seguimiento ex post; evaluación excelente (5/5) en todos los criterios, con manejo de finanzas muy bueno (4/5). Las ventas acumuladas de tres meses (mayo-julio) ascienden a USD 2.212,43. Es fundamental crear mayores oportunidades de mejora en la generación de ingresos, con el fin de aumentar su flujo de caja y obtener mayores ganancias.</w:t>
+        <w:t>Alto nivel de compromiso y participación durante el proceso de seguimiento ex post; evaluación excelente (5/5) en todos los criterios, con manejo de finanzas muy bueno (4/5). Las ventas acumuladas de tres meses (mayo-julio) ascienden a USD 2.212,43; en el período analizado no se registró información de ingresos ni de gastos, por lo que no es posible validar el manejo financiero. Se recomienda regularizar de inmediato el registro mensual de ventas y gastos. Es fundamental crear mayores oportunidades de mejora en la generación de ingresos, con el fin de aumentar su flujo de caja y obtener mayores ganancias.</w:t>
       </w:r>
     </w:p>
     <w:p>

</xml_diff>